<commit_message>
Lesson plans: fix Cornell Notes materials accuracy
The generic template listed both "Guided Notes" and "Cornell Notes" as separate
student prints, which read as two note pages. In U.S. History Hack there is one
student note page — the Cornell Notes (Universal Front) — and the scaffolds
(Cornell Support Backs) live in the Teacher Organizer Toolkit (moved out of the
student workbook per the earlier rescope), printed duplex on the reverse and
copied only as needed for MTSS.

- §3/§4/§8/§10/§11 and the TEAM appendix now use "Cornell Notes" consistently;
  no more standalone "Guided Notes" artifact.
- §10 Materials: student column = Cornell Notes (Universal Front); teacher column
  adds "Cornell Support Backs — toolkit (copy as needed, MTSS)", plus an explicit
  duplex/fade note.
- Regenerated US.01–US.07 + binder (DOCX + PDF) and manifest.

Co-Authored-By: Claude Opus 4.8 <noreply@anthropic.com>
Claude-Session: https://claude.ai/code/session_01HhaUpx6aH2mjCLGc2rqqvc
</commit_message>
<xml_diff>
--- a/HistoryHack_Platinum/deliverables_unit1/lesson_plans/US01_TEAM_Lesson_Plan.docx
+++ b/HistoryHack_Platinum/deliverables_unit1/lesson_plans/US01_TEAM_Lesson_Plan.docx
@@ -584,7 +584,7 @@
                 <w:sz w:val="16"/>
                 <w:szCs w:val="16"/>
               </w:rPr>
-              <w:t xml:space="preserve">Guided Notes (Do-Now box)</w:t>
+              <w:t xml:space="preserve">Word Bank / Do-Now</w:t>
             </w:r>
           </w:p>
         </w:tc>
@@ -699,7 +699,7 @@
                 <w:sz w:val="16"/>
                 <w:szCs w:val="16"/>
               </w:rPr>
-              <w:t xml:space="preserve">Direct Instruction — teacher models close reading of the core content; students capture guided notes</w:t>
+              <w:t xml:space="preserve">Direct Instruction — teacher models close reading of the core content; students capture Cornell Notes</w:t>
             </w:r>
           </w:p>
         </w:tc>
@@ -720,7 +720,7 @@
                 <w:sz w:val="16"/>
                 <w:szCs w:val="16"/>
               </w:rPr>
-              <w:t xml:space="preserve">Teacher Deck + Guided Notes</w:t>
+              <w:t xml:space="preserve">Teacher Deck + Cornell Notes</w:t>
             </w:r>
           </w:p>
         </w:tc>
@@ -977,7 +977,7 @@
           <w:sz w:val="17"/>
           <w:szCs w:val="17"/>
         </w:rPr>
-        <w:t xml:space="preserve">Guided Notes — scaffolded direct-instruction capture</w:t>
+        <w:t xml:space="preserve">Cornell Notes (Universal Front) — direct-teaching capture (cue / notes / summary)</w:t>
       </w:r>
     </w:p>
     <w:p>
@@ -994,7 +994,7 @@
           <w:sz w:val="17"/>
           <w:szCs w:val="17"/>
         </w:rPr>
-        <w:t xml:space="preserve">Cornell Notes — cue/notes/summary for retention</w:t>
+        <w:t xml:space="preserve">Cornell Support Backs — optional MTSS scaffold; lives in the Teacher Organizer Toolkit, prints duplex behind the Cornell front, copy only as needed</w:t>
       </w:r>
     </w:p>
     <w:p>
@@ -1643,7 +1643,7 @@
           <w:sz w:val="17"/>
           <w:szCs w:val="17"/>
         </w:rPr>
-        <w:t xml:space="preserve">chunked guided notes, extended time, read-aloud (browser TTS), reduced-item formative option.</w:t>
+        <w:t xml:space="preserve">chunked Cornell Notes (with the support back), extended time, read-aloud (browser TTS), reduced-item formative option.</w:t>
       </w:r>
     </w:p>
     <w:p>
@@ -1856,7 +1856,7 @@
                 <w:sz w:val="16"/>
                 <w:szCs w:val="16"/>
               </w:rPr>
-              <w:t xml:space="preserve">Guided Notes</w:t>
+              <w:t xml:space="preserve">Cornell Notes (Universal Front)</w:t>
             </w:r>
           </w:p>
         </w:tc>
@@ -1901,7 +1901,7 @@
                 <w:sz w:val="16"/>
                 <w:szCs w:val="16"/>
               </w:rPr>
-              <w:t xml:space="preserve">Cornell Notes</w:t>
+              <w:t xml:space="preserve">Comparison / analysis organizer</w:t>
             </w:r>
           </w:p>
         </w:tc>
@@ -1923,7 +1923,7 @@
                 <w:sz w:val="16"/>
                 <w:szCs w:val="16"/>
               </w:rPr>
-              <w:t xml:space="preserve">Formative Assessment — Answer Key</w:t>
+              <w:t xml:space="preserve">Cornell Support Backs — toolkit (copy as needed, MTSS)</w:t>
             </w:r>
           </w:p>
         </w:tc>
@@ -1946,7 +1946,7 @@
                 <w:sz w:val="16"/>
                 <w:szCs w:val="16"/>
               </w:rPr>
-              <w:t xml:space="preserve">Comparison / analysis organizer</w:t>
+              <w:t xml:space="preserve">CER organizer</w:t>
             </w:r>
           </w:p>
         </w:tc>
@@ -1968,7 +1968,7 @@
                 <w:sz w:val="16"/>
                 <w:szCs w:val="16"/>
               </w:rPr>
-              <w:t xml:space="preserve">Primary-Source Teacher Guide</w:t>
+              <w:t xml:space="preserve">Formative Assessment — Answer Key</w:t>
             </w:r>
           </w:p>
         </w:tc>
@@ -1991,7 +1991,7 @@
                 <w:sz w:val="16"/>
                 <w:szCs w:val="16"/>
               </w:rPr>
-              <w:t xml:space="preserve">CER organizer</w:t>
+              <w:t xml:space="preserve">HIPP organizer</w:t>
             </w:r>
           </w:p>
         </w:tc>
@@ -2013,7 +2013,7 @@
                 <w:sz w:val="16"/>
                 <w:szCs w:val="16"/>
               </w:rPr>
-              <w:t xml:space="preserve">UDL / WIDA overlay</w:t>
+              <w:t xml:space="preserve">Primary-Source Teacher Guide</w:t>
             </w:r>
           </w:p>
         </w:tc>
@@ -2036,7 +2036,7 @@
                 <w:sz w:val="16"/>
                 <w:szCs w:val="16"/>
               </w:rPr>
-              <w:t xml:space="preserve">HIPP organizer</w:t>
+              <w:t xml:space="preserve">Primary-Source Packet</w:t>
             </w:r>
           </w:p>
         </w:tc>
@@ -2058,7 +2058,7 @@
                 <w:sz w:val="16"/>
                 <w:szCs w:val="16"/>
               </w:rPr>
-              <w:t xml:space="preserve">File Map &amp; Print Guide</w:t>
+              <w:t xml:space="preserve">UDL / WIDA overlay</w:t>
             </w:r>
           </w:p>
         </w:tc>
@@ -2081,7 +2081,7 @@
                 <w:sz w:val="16"/>
                 <w:szCs w:val="16"/>
               </w:rPr>
-              <w:t xml:space="preserve">Primary-Source Packet</w:t>
+              <w:t xml:space="preserve">Formative Assessment</w:t>
             </w:r>
           </w:p>
         </w:tc>
@@ -2089,6 +2089,51 @@
           <w:tcPr>
             <w:tcW w:type="dxa" w:w="4530"/>
             <w:shd w:fill="FFFFFF" w:color="auto" w:val="clear"/>
+            <w:tcMar>
+              <w:top w:type="dxa" w:w="60"/>
+              <w:left w:type="dxa" w:w="100"/>
+              <w:bottom w:type="dxa" w:w="60"/>
+              <w:right w:type="dxa" w:w="100"/>
+            </w:tcMar>
+          </w:tcPr>
+          <w:p>
+            <w:r>
+              <w:rPr>
+                <w:color w:val="222222"/>
+                <w:sz w:val="16"/>
+                <w:szCs w:val="16"/>
+              </w:rPr>
+              <w:t xml:space="preserve">File Map &amp; Print Guide</w:t>
+            </w:r>
+          </w:p>
+        </w:tc>
+      </w:tr>
+      <w:tr>
+        <w:tc>
+          <w:tcPr>
+            <w:tcW w:type="dxa" w:w="4530"/>
+            <w:shd w:fill="EEF2F6" w:color="auto" w:val="clear"/>
+            <w:tcMar>
+              <w:top w:type="dxa" w:w="60"/>
+              <w:left w:type="dxa" w:w="100"/>
+              <w:bottom w:type="dxa" w:w="60"/>
+              <w:right w:type="dxa" w:w="100"/>
+            </w:tcMar>
+          </w:tcPr>
+          <w:p>
+            <w:r>
+              <w:rPr>
+                <w:sz w:val="16"/>
+                <w:szCs w:val="16"/>
+              </w:rPr>
+              <w:t xml:space="preserve">Exit Ticket — English &amp; Spanish</w:t>
+            </w:r>
+          </w:p>
+        </w:tc>
+        <w:tc>
+          <w:tcPr>
+            <w:tcW w:type="dxa" w:w="4530"/>
+            <w:shd w:fill="EEF2F6" w:color="auto" w:val="clear"/>
             <w:tcMar>
               <w:top w:type="dxa" w:w="60"/>
               <w:left w:type="dxa" w:w="100"/>
@@ -2108,97 +2153,22 @@
           </w:p>
         </w:tc>
       </w:tr>
-      <w:tr>
-        <w:tc>
-          <w:tcPr>
-            <w:tcW w:type="dxa" w:w="4530"/>
-            <w:shd w:fill="EEF2F6" w:color="auto" w:val="clear"/>
-            <w:tcMar>
-              <w:top w:type="dxa" w:w="60"/>
-              <w:left w:type="dxa" w:w="100"/>
-              <w:bottom w:type="dxa" w:w="60"/>
-              <w:right w:type="dxa" w:w="100"/>
-            </w:tcMar>
-          </w:tcPr>
-          <w:p>
-            <w:r>
-              <w:rPr>
-                <w:sz w:val="16"/>
-                <w:szCs w:val="16"/>
-              </w:rPr>
-              <w:t xml:space="preserve">Formative Assessment</w:t>
-            </w:r>
-          </w:p>
-        </w:tc>
-        <w:tc>
-          <w:tcPr>
-            <w:tcW w:type="dxa" w:w="4530"/>
-            <w:shd w:fill="EEF2F6" w:color="auto" w:val="clear"/>
-            <w:tcMar>
-              <w:top w:type="dxa" w:w="60"/>
-              <w:left w:type="dxa" w:w="100"/>
-              <w:bottom w:type="dxa" w:w="60"/>
-              <w:right w:type="dxa" w:w="100"/>
-            </w:tcMar>
-          </w:tcPr>
-          <w:p>
-            <w:r>
-              <w:rPr>
-                <w:color w:val="FFFFFF"/>
-                <w:sz w:val="16"/>
-                <w:szCs w:val="16"/>
-              </w:rPr>
-              <w:t xml:space="preserve"/>
-            </w:r>
-          </w:p>
-        </w:tc>
-      </w:tr>
-      <w:tr>
-        <w:tc>
-          <w:tcPr>
-            <w:tcW w:type="dxa" w:w="4530"/>
-            <w:shd w:fill="FFFFFF" w:color="auto" w:val="clear"/>
-            <w:tcMar>
-              <w:top w:type="dxa" w:w="60"/>
-              <w:left w:type="dxa" w:w="100"/>
-              <w:bottom w:type="dxa" w:w="60"/>
-              <w:right w:type="dxa" w:w="100"/>
-            </w:tcMar>
-          </w:tcPr>
-          <w:p>
-            <w:r>
-              <w:rPr>
-                <w:sz w:val="16"/>
-                <w:szCs w:val="16"/>
-              </w:rPr>
-              <w:t xml:space="preserve">Exit Ticket — English &amp; Spanish</w:t>
-            </w:r>
-          </w:p>
-        </w:tc>
-        <w:tc>
-          <w:tcPr>
-            <w:tcW w:type="dxa" w:w="4530"/>
-            <w:shd w:fill="FFFFFF" w:color="auto" w:val="clear"/>
-            <w:tcMar>
-              <w:top w:type="dxa" w:w="60"/>
-              <w:left w:type="dxa" w:w="100"/>
-              <w:bottom w:type="dxa" w:w="60"/>
-              <w:right w:type="dxa" w:w="100"/>
-            </w:tcMar>
-          </w:tcPr>
-          <w:p>
-            <w:r>
-              <w:rPr>
-                <w:color w:val="FFFFFF"/>
-                <w:sz w:val="16"/>
-                <w:szCs w:val="16"/>
-              </w:rPr>
-              <w:t xml:space="preserve"/>
-            </w:r>
-          </w:p>
-        </w:tc>
-      </w:tr>
     </w:tbl>
+    <w:p>
+      <w:pPr>
+        <w:spacing w:before="40"/>
+      </w:pPr>
+      <w:r>
+        <w:rPr>
+          <w:i/>
+          <w:iCs/>
+          <w:color w:val="555555"/>
+          <w:sz w:val="15"/>
+          <w:szCs w:val="15"/>
+        </w:rPr>
+        <w:t xml:space="preserve">Note: students print the Cornell Notes Universal Front. The Cornell Support Backs (Guided/Light scaffolds) live in the Teacher Organizer Toolkit and print duplex on the reverse — copy them only for students who need them (MTSS), and fade as evidence grows.</w:t>
+      </w:r>
+    </w:p>
     <w:p>
       <w:pPr>
         <w:spacing w:after="40" w:before="100"/>
@@ -2402,7 +2372,7 @@
           <w:sz w:val="17"/>
           <w:szCs w:val="17"/>
         </w:rPr>
-        <w:t xml:space="preserve">Below ~70% mastery on the exit ticket / formative → reteach with entry-tier materials (guided notes + a shorter source) in a small group — MTSS Tier 2.</w:t>
+        <w:t xml:space="preserve">Below ~70% mastery on the exit ticket / formative → reteach with entry-tier materials (Cornell Notes + the Cornell Support Back + a shorter source) in a small group — MTSS Tier 2.</w:t>
       </w:r>
     </w:p>
     <w:p>
@@ -2680,7 +2650,7 @@
                 <w:sz w:val="15"/>
                 <w:szCs w:val="15"/>
               </w:rPr>
-              <w:t xml:space="preserve">§3 DI — deck visuals + guided notes + modeling</w:t>
+              <w:t xml:space="preserve">§3 DI — deck visuals + Cornell Notes + modeling</w:t>
             </w:r>
           </w:p>
         </w:tc>

</xml_diff>